<commit_message>
updated leetCode self_learning assignment
</commit_message>
<xml_diff>
--- a/self_learning/DBT_Joins_LeetCode_selfLearning.docx
+++ b/self_learning/DBT_Joins_LeetCode_selfLearning.docx
@@ -130,6 +130,7 @@
         <w:rPr>
           <w:b/>
           <w:bCs/>
+          <w:noProof/>
         </w:rPr>
         <w:drawing>
           <wp:inline distT="0" distB="0" distL="0" distR="0" wp14:anchorId="521534EA" wp14:editId="57B3C350">
@@ -228,6 +229,7 @@
         <w:rPr>
           <w:b/>
           <w:bCs/>
+          <w:noProof/>
         </w:rPr>
         <w:drawing>
           <wp:inline distT="0" distB="0" distL="0" distR="0" wp14:anchorId="4D0CC59F" wp14:editId="64E12C46">
@@ -326,6 +328,7 @@
         <w:rPr>
           <w:b/>
           <w:bCs/>
+          <w:noProof/>
         </w:rPr>
         <w:lastRenderedPageBreak/>
         <w:drawing>
@@ -425,6 +428,7 @@
         <w:rPr>
           <w:b/>
           <w:bCs/>
+          <w:noProof/>
         </w:rPr>
         <w:drawing>
           <wp:inline distT="0" distB="0" distL="0" distR="0" wp14:anchorId="12B576F5" wp14:editId="66990ECE">
@@ -501,6 +505,24 @@
           <w:t>https://leetcode.com/problems/managers-with-at-least-5-direct-reports</w:t>
         </w:r>
       </w:hyperlink>
+    </w:p>
+    <w:p>
+      <w:pPr>
+        <w:pStyle w:val="ListParagraph"/>
+        <w:rPr>
+          <w:b/>
+          <w:bCs/>
+        </w:rPr>
+      </w:pPr>
+    </w:p>
+    <w:p>
+      <w:pPr>
+        <w:pStyle w:val="ListParagraph"/>
+        <w:rPr>
+          <w:b/>
+          <w:bCs/>
+        </w:rPr>
+      </w:pPr>
     </w:p>
     <w:p>
       <w:pPr>
@@ -1243,6 +1265,7 @@
   <w:style w:type="character" w:default="1" w:styleId="DefaultParagraphFont">
     <w:name w:val="Default Paragraph Font"/>
     <w:uiPriority w:val="1"/>
+    <w:semiHidden/>
     <w:unhideWhenUsed/>
   </w:style>
   <w:style w:type="table" w:default="1" w:styleId="TableNormal">

</xml_diff>